<commit_message>
WIP-19.8 reconcile europrotocol notices and sync objections
</commit_message>
<xml_diff>
--- a/editable_docx/04_Ходатайство_о_страховщиках.docx
+++ b/editable_docx/04_Ходатайство_о_страховщиках.docx
@@ -5,67 +5,52 @@
     <w:p>
       <w:pPr>
         <w:pStyle w:val="Heading1"/>
-        <w:spacing w:before="0"/>
         <w:jc w:val="center"/>
       </w:pPr>
       <w:r>
         <w:rPr>
-          <w:rFonts w:ascii="Times New Roman" w:hAnsi="Times New Roman" w:cs="Times New Roman" w:eastAsia="Times New Roman"/>
+          <w:rFonts w:ascii="Times New Roman" w:hAnsi="Times New Roman" w:eastAsia="Times New Roman"/>
           <w:b/>
-          <w:i w:val="0"/>
           <w:color w:val="000000"/>
-          <w:sz w:val="23"/>
         </w:rPr>
         <w:t>В Тимирязевский районный суд г. Москвы</w:t>
       </w:r>
     </w:p>
     <w:p>
       <w:pPr>
-        <w:spacing w:before="120"/>
-        <w:ind w:firstLine="0"/>
-        <w:jc w:val="left"/>
+        <w:widowControl/>
+        <w:jc w:val="both"/>
       </w:pPr>
       <w:r>
         <w:rPr>
-          <w:rFonts w:ascii="Times New Roman" w:hAnsi="Times New Roman" w:cs="Times New Roman" w:eastAsia="Times New Roman"/>
+          <w:rFonts w:ascii="Times New Roman" w:hAnsi="Times New Roman" w:eastAsia="Times New Roman"/>
           <w:b/>
-          <w:i w:val="0"/>
-          <w:color w:val="000000"/>
-          <w:sz w:val="22"/>
         </w:rPr>
         <w:t>Дело № 02-5004/2026</w:t>
       </w:r>
     </w:p>
     <w:p>
       <w:pPr>
-        <w:spacing w:after="40"/>
-        <w:ind w:firstLine="0"/>
-        <w:jc w:val="left"/>
+        <w:widowControl/>
+        <w:jc w:val="both"/>
       </w:pPr>
       <w:r>
         <w:rPr>
-          <w:rFonts w:ascii="Times New Roman" w:hAnsi="Times New Roman" w:cs="Times New Roman" w:eastAsia="Times New Roman"/>
-          <w:b/>
-          <w:i w:val="0"/>
-          <w:color w:val="000000"/>
-          <w:sz w:val="22"/>
+          <w:rFonts w:ascii="Times New Roman" w:hAnsi="Times New Roman" w:eastAsia="Times New Roman"/>
+          <w:b w:val="0"/>
         </w:rPr>
         <w:t>Истец: ООО «ВИГОРАВТО»</w:t>
       </w:r>
     </w:p>
     <w:p>
       <w:pPr>
-        <w:spacing w:after="40"/>
-        <w:ind w:firstLine="0"/>
-        <w:jc w:val="left"/>
+        <w:widowControl/>
+        <w:jc w:val="both"/>
       </w:pPr>
       <w:r>
         <w:rPr>
-          <w:rFonts w:ascii="Times New Roman" w:hAnsi="Times New Roman" w:cs="Times New Roman" w:eastAsia="Times New Roman"/>
-          <w:b/>
-          <w:i w:val="0"/>
-          <w:color w:val="000000"/>
-          <w:sz w:val="22"/>
+          <w:rFonts w:ascii="Times New Roman" w:hAnsi="Times New Roman" w:eastAsia="Times New Roman"/>
+          <w:b w:val="0"/>
         </w:rPr>
         <w:t>Ответчик: Димитриева Марина Владимировна</w:t>
       </w:r>
@@ -73,341 +58,232 @@
     <w:p>
       <w:pPr>
         <w:pStyle w:val="Title"/>
-        <w:spacing w:before="200"/>
         <w:jc w:val="center"/>
       </w:pPr>
       <w:r>
         <w:rPr>
-          <w:rFonts w:ascii="Times New Roman" w:hAnsi="Times New Roman" w:cs="Times New Roman" w:eastAsia="Times New Roman"/>
+          <w:rFonts w:ascii="Times New Roman" w:hAnsi="Times New Roman" w:eastAsia="Times New Roman"/>
           <w:b/>
-          <w:i w:val="0"/>
           <w:color w:val="000000"/>
-          <w:sz w:val="30"/>
         </w:rPr>
         <w:t>ХОДАТАЙСТВО</w:t>
       </w:r>
     </w:p>
     <w:p>
       <w:pPr>
-        <w:ind w:firstLine="709"/>
+        <w:widowControl/>
+        <w:jc w:val="both"/>
       </w:pPr>
       <w:r>
         <w:rPr>
-          <w:rFonts w:ascii="Times New Roman" w:hAnsi="Times New Roman" w:cs="Times New Roman" w:eastAsia="Times New Roman"/>
+          <w:rFonts w:ascii="Times New Roman" w:hAnsi="Times New Roman" w:eastAsia="Times New Roman"/>
           <w:b w:val="0"/>
-          <w:i w:val="0"/>
-          <w:color w:val="000000"/>
-          <w:sz w:val="22"/>
         </w:rPr>
         <w:t>о процессуальном статусе страховщиков</w:t>
       </w:r>
     </w:p>
     <w:p>
       <w:pPr>
-        <w:ind w:firstLine="709"/>
+        <w:widowControl/>
+        <w:jc w:val="both"/>
       </w:pPr>
       <w:r>
         <w:rPr>
-          <w:rFonts w:ascii="Times New Roman" w:hAnsi="Times New Roman" w:cs="Times New Roman" w:eastAsia="Times New Roman"/>
+          <w:rFonts w:ascii="Times New Roman" w:hAnsi="Times New Roman" w:eastAsia="Times New Roman"/>
           <w:b w:val="0"/>
-          <w:i w:val="0"/>
-          <w:color w:val="000000"/>
-          <w:sz w:val="22"/>
         </w:rPr>
         <w:t>В материалах одновременно фигурируют:</w:t>
       </w:r>
     </w:p>
     <w:p>
       <w:pPr>
-        <w:spacing w:after="40"/>
-        <w:ind w:left="510" w:hanging="227"/>
+        <w:widowControl/>
+        <w:ind w:left="317" w:hanging="230"/>
         <w:jc w:val="both"/>
       </w:pPr>
       <w:r>
         <w:rPr>
-          <w:rFonts w:ascii="Times New Roman" w:hAnsi="Times New Roman" w:cs="Times New Roman" w:eastAsia="Times New Roman"/>
-          <w:color w:val="000000"/>
-          <w:sz w:val="22"/>
+          <w:rFonts w:ascii="Times New Roman" w:hAnsi="Times New Roman" w:eastAsia="Times New Roman"/>
+          <w:b w:val="0"/>
         </w:rPr>
-        <w:t xml:space="preserve">• </w:t>
-      </w:r>
-      <w:r>
-        <w:rPr>
-          <w:rFonts w:ascii="Times New Roman" w:hAnsi="Times New Roman" w:cs="Times New Roman" w:eastAsia="Times New Roman"/>
-          <w:b w:val="0"/>
-          <w:i w:val="0"/>
-          <w:color w:val="000000"/>
-          <w:sz w:val="22"/>
-        </w:rPr>
-        <w:t>КАСКО-договор № 65/22-04(7)-000217;</w:t>
+        <w:t>• КАСКО-договор № 65/22-04(7)-000217;</w:t>
       </w:r>
     </w:p>
     <w:p>
       <w:pPr>
-        <w:spacing w:after="40"/>
-        <w:ind w:left="510" w:hanging="227"/>
+        <w:widowControl/>
+        <w:ind w:left="317" w:hanging="230"/>
         <w:jc w:val="both"/>
       </w:pPr>
       <w:r>
         <w:rPr>
-          <w:rFonts w:ascii="Times New Roman" w:hAnsi="Times New Roman" w:cs="Times New Roman" w:eastAsia="Times New Roman"/>
-          <w:color w:val="000000"/>
-          <w:sz w:val="22"/>
+          <w:rFonts w:ascii="Times New Roman" w:hAnsi="Times New Roman" w:eastAsia="Times New Roman"/>
+          <w:b w:val="0"/>
         </w:rPr>
-        <w:t xml:space="preserve">• </w:t>
-      </w:r>
-      <w:r>
-        <w:rPr>
-          <w:rFonts w:ascii="Times New Roman" w:hAnsi="Times New Roman" w:cs="Times New Roman" w:eastAsia="Times New Roman"/>
-          <w:b w:val="0"/>
-          <w:i w:val="0"/>
-          <w:color w:val="000000"/>
-          <w:sz w:val="22"/>
-        </w:rPr>
-        <w:t>выплатное дело № 065/23-04-001505;</w:t>
+        <w:t>• выплатное дело № 065/23-04-001505;</w:t>
       </w:r>
     </w:p>
     <w:p>
       <w:pPr>
-        <w:spacing w:after="40"/>
-        <w:ind w:left="510" w:hanging="227"/>
+        <w:widowControl/>
+        <w:ind w:left="317" w:hanging="230"/>
         <w:jc w:val="both"/>
       </w:pPr>
       <w:r>
         <w:rPr>
-          <w:rFonts w:ascii="Times New Roman" w:hAnsi="Times New Roman" w:cs="Times New Roman" w:eastAsia="Times New Roman"/>
-          <w:color w:val="000000"/>
-          <w:sz w:val="22"/>
+          <w:rFonts w:ascii="Times New Roman" w:hAnsi="Times New Roman" w:eastAsia="Times New Roman"/>
+          <w:b w:val="0"/>
         </w:rPr>
-        <w:t xml:space="preserve">• </w:t>
-      </w:r>
-      <w:r>
-        <w:rPr>
-          <w:rFonts w:ascii="Times New Roman" w:hAnsi="Times New Roman" w:cs="Times New Roman" w:eastAsia="Times New Roman"/>
-          <w:b w:val="0"/>
-          <w:i w:val="0"/>
-          <w:color w:val="000000"/>
-          <w:sz w:val="22"/>
-        </w:rPr>
-        <w:t>полис ХХХ 0284409797, указанный истцом;</w:t>
+        <w:t>• полис ОСАГО ХХХ 0284409797, указанный в электронном извещении о ДТП у АО ГСК «Югория»;</w:t>
       </w:r>
     </w:p>
     <w:p>
       <w:pPr>
-        <w:spacing w:after="40"/>
-        <w:ind w:left="510" w:hanging="227"/>
+        <w:widowControl/>
+        <w:ind w:left="317" w:hanging="230"/>
         <w:jc w:val="both"/>
       </w:pPr>
       <w:r>
         <w:rPr>
-          <w:rFonts w:ascii="Times New Roman" w:hAnsi="Times New Roman" w:cs="Times New Roman" w:eastAsia="Times New Roman"/>
-          <w:color w:val="000000"/>
-          <w:sz w:val="22"/>
+          <w:rFonts w:ascii="Times New Roman" w:hAnsi="Times New Roman" w:eastAsia="Times New Roman"/>
+          <w:b w:val="0"/>
         </w:rPr>
-        <w:t xml:space="preserve">• </w:t>
-      </w:r>
-      <w:r>
-        <w:rPr>
-          <w:rFonts w:ascii="Times New Roman" w:hAnsi="Times New Roman" w:cs="Times New Roman" w:eastAsia="Times New Roman"/>
-          <w:b w:val="0"/>
-          <w:i w:val="0"/>
-          <w:color w:val="000000"/>
-          <w:sz w:val="22"/>
-        </w:rPr>
-        <w:t>ОСАГО ответчика ТТТ 7043868396;</w:t>
+        <w:t>• ОСАГО ответчика ТТТ 7043868396;</w:t>
       </w:r>
     </w:p>
     <w:p>
       <w:pPr>
-        <w:spacing w:after="40"/>
-        <w:ind w:left="510" w:hanging="227"/>
+        <w:widowControl/>
+        <w:ind w:left="317" w:hanging="230"/>
         <w:jc w:val="both"/>
       </w:pPr>
       <w:r>
         <w:rPr>
-          <w:rFonts w:ascii="Times New Roman" w:hAnsi="Times New Roman" w:cs="Times New Roman" w:eastAsia="Times New Roman"/>
-          <w:color w:val="000000"/>
-          <w:sz w:val="22"/>
+          <w:rFonts w:ascii="Times New Roman" w:hAnsi="Times New Roman" w:eastAsia="Times New Roman"/>
+          <w:b w:val="0"/>
         </w:rPr>
-        <w:t xml:space="preserve">• </w:t>
-      </w:r>
-      <w:r>
-        <w:rPr>
-          <w:rFonts w:ascii="Times New Roman" w:hAnsi="Times New Roman" w:cs="Times New Roman" w:eastAsia="Times New Roman"/>
-          <w:b w:val="0"/>
-          <w:i w:val="0"/>
-          <w:color w:val="000000"/>
-          <w:sz w:val="22"/>
-        </w:rPr>
-        <w:t>ответ АО ГСК «Югория» со ссылкой на норму Закона об ОСАГО.</w:t>
+        <w:t>• ответ АО ГСК «Югория» со ссылкой на норму Закона об ОСАГО.</w:t>
       </w:r>
     </w:p>
     <w:p>
       <w:pPr>
-        <w:ind w:firstLine="709"/>
+        <w:widowControl/>
+        <w:jc w:val="both"/>
       </w:pPr>
       <w:r>
         <w:rPr>
-          <w:rFonts w:ascii="Times New Roman" w:hAnsi="Times New Roman" w:cs="Times New Roman" w:eastAsia="Times New Roman"/>
+          <w:rFonts w:ascii="Times New Roman" w:hAnsi="Times New Roman" w:eastAsia="Times New Roman"/>
           <w:b w:val="0"/>
-          <w:i w:val="0"/>
-          <w:color w:val="000000"/>
-          <w:sz w:val="22"/>
         </w:rPr>
         <w:t>При отсутствии полного страхового дела не установлены:</w:t>
       </w:r>
     </w:p>
     <w:p>
       <w:pPr>
-        <w:spacing w:after="40"/>
-        <w:ind w:left="510" w:hanging="227"/>
+        <w:widowControl/>
+        <w:ind w:left="317" w:hanging="230"/>
         <w:jc w:val="both"/>
       </w:pPr>
       <w:r>
         <w:rPr>
-          <w:rFonts w:ascii="Times New Roman" w:hAnsi="Times New Roman" w:cs="Times New Roman" w:eastAsia="Times New Roman"/>
-          <w:color w:val="000000"/>
-          <w:sz w:val="22"/>
+          <w:rFonts w:ascii="Times New Roman" w:hAnsi="Times New Roman" w:eastAsia="Times New Roman"/>
+          <w:b w:val="0"/>
         </w:rPr>
-        <w:t xml:space="preserve">• </w:t>
-      </w:r>
-      <w:r>
-        <w:rPr>
-          <w:rFonts w:ascii="Times New Roman" w:hAnsi="Times New Roman" w:cs="Times New Roman" w:eastAsia="Times New Roman"/>
-          <w:b w:val="0"/>
-          <w:i w:val="0"/>
-          <w:color w:val="000000"/>
-          <w:sz w:val="22"/>
-        </w:rPr>
-        <w:t>фактическое перечисление 57 100 руб.;</w:t>
+        <w:t>• фактическое перечисление 57 100 руб.;</w:t>
       </w:r>
     </w:p>
     <w:p>
       <w:pPr>
-        <w:spacing w:after="40"/>
-        <w:ind w:left="510" w:hanging="227"/>
+        <w:widowControl/>
+        <w:ind w:left="317" w:hanging="230"/>
         <w:jc w:val="both"/>
       </w:pPr>
       <w:r>
         <w:rPr>
-          <w:rFonts w:ascii="Times New Roman" w:hAnsi="Times New Roman" w:cs="Times New Roman" w:eastAsia="Times New Roman"/>
-          <w:color w:val="000000"/>
-          <w:sz w:val="22"/>
+          <w:rFonts w:ascii="Times New Roman" w:hAnsi="Times New Roman" w:eastAsia="Times New Roman"/>
+          <w:b w:val="0"/>
         </w:rPr>
-        <w:t xml:space="preserve">• </w:t>
-      </w:r>
-      <w:r>
-        <w:rPr>
-          <w:rFonts w:ascii="Times New Roman" w:hAnsi="Times New Roman" w:cs="Times New Roman" w:eastAsia="Times New Roman"/>
-          <w:b w:val="0"/>
-          <w:i w:val="0"/>
-          <w:color w:val="000000"/>
-          <w:sz w:val="22"/>
-        </w:rPr>
-        <w:t>содержание Соглашения от 20.11.2023;</w:t>
+        <w:t>• содержание Соглашения от 20.11.2023;</w:t>
       </w:r>
     </w:p>
     <w:p>
       <w:pPr>
-        <w:spacing w:after="40"/>
-        <w:ind w:left="510" w:hanging="227"/>
+        <w:widowControl/>
+        <w:ind w:left="317" w:hanging="230"/>
         <w:jc w:val="both"/>
       </w:pPr>
       <w:r>
         <w:rPr>
-          <w:rFonts w:ascii="Times New Roman" w:hAnsi="Times New Roman" w:cs="Times New Roman" w:eastAsia="Times New Roman"/>
-          <w:color w:val="000000"/>
-          <w:sz w:val="22"/>
+          <w:rFonts w:ascii="Times New Roman" w:hAnsi="Times New Roman" w:eastAsia="Times New Roman"/>
+          <w:b w:val="0"/>
         </w:rPr>
-        <w:t xml:space="preserve">• </w:t>
-      </w:r>
-      <w:r>
-        <w:rPr>
-          <w:rFonts w:ascii="Times New Roman" w:hAnsi="Times New Roman" w:cs="Times New Roman" w:eastAsia="Times New Roman"/>
-          <w:b w:val="0"/>
-          <w:i w:val="0"/>
-          <w:color w:val="000000"/>
-          <w:sz w:val="22"/>
-        </w:rPr>
-        <w:t>надлежащий размер возмещения по ОСАГО;</w:t>
+        <w:t>• подтверждение полиса ХХХ 0284409797 по официальному реестру;</w:t>
       </w:r>
     </w:p>
     <w:p>
       <w:pPr>
-        <w:spacing w:after="40"/>
-        <w:ind w:left="510" w:hanging="227"/>
+        <w:widowControl/>
+        <w:ind w:left="317" w:hanging="230"/>
         <w:jc w:val="both"/>
       </w:pPr>
       <w:r>
         <w:rPr>
-          <w:rFonts w:ascii="Times New Roman" w:hAnsi="Times New Roman" w:cs="Times New Roman" w:eastAsia="Times New Roman"/>
-          <w:color w:val="000000"/>
-          <w:sz w:val="22"/>
+          <w:rFonts w:ascii="Times New Roman" w:hAnsi="Times New Roman" w:eastAsia="Times New Roman"/>
+          <w:b w:val="0"/>
         </w:rPr>
-        <w:t xml:space="preserve">• </w:t>
-      </w:r>
-      <w:r>
-        <w:rPr>
-          <w:rFonts w:ascii="Times New Roman" w:hAnsi="Times New Roman" w:cs="Times New Roman" w:eastAsia="Times New Roman"/>
-          <w:b w:val="0"/>
-          <w:i w:val="0"/>
-          <w:color w:val="000000"/>
-          <w:sz w:val="22"/>
-        </w:rPr>
-        <w:t>наличие суброгации;</w:t>
+        <w:t>• надлежащий размер возмещения по ОСАГО;</w:t>
       </w:r>
     </w:p>
     <w:p>
       <w:pPr>
-        <w:spacing w:after="40"/>
-        <w:ind w:left="510" w:hanging="227"/>
+        <w:widowControl/>
+        <w:ind w:left="317" w:hanging="230"/>
         <w:jc w:val="both"/>
       </w:pPr>
       <w:r>
         <w:rPr>
-          <w:rFonts w:ascii="Times New Roman" w:hAnsi="Times New Roman" w:cs="Times New Roman" w:eastAsia="Times New Roman"/>
-          <w:color w:val="000000"/>
-          <w:sz w:val="22"/>
+          <w:rFonts w:ascii="Times New Roman" w:hAnsi="Times New Roman" w:eastAsia="Times New Roman"/>
+          <w:b w:val="0"/>
         </w:rPr>
-        <w:t xml:space="preserve">• </w:t>
-      </w:r>
-      <w:r>
-        <w:rPr>
-          <w:rFonts w:ascii="Times New Roman" w:hAnsi="Times New Roman" w:cs="Times New Roman" w:eastAsia="Times New Roman"/>
-          <w:b w:val="0"/>
-          <w:i w:val="0"/>
-          <w:color w:val="000000"/>
-          <w:sz w:val="22"/>
-        </w:rPr>
-        <w:t>связь между перечисленными страховыми документами.</w:t>
+        <w:t>• наличие суброгации;</w:t>
       </w:r>
     </w:p>
     <w:p>
       <w:pPr>
-        <w:ind w:firstLine="709"/>
+        <w:widowControl/>
+        <w:ind w:left="317" w:hanging="230"/>
+        <w:jc w:val="both"/>
       </w:pPr>
       <w:r>
         <w:rPr>
-          <w:rFonts w:ascii="Times New Roman" w:hAnsi="Times New Roman" w:cs="Times New Roman" w:eastAsia="Times New Roman"/>
+          <w:rFonts w:ascii="Times New Roman" w:hAnsi="Times New Roman" w:eastAsia="Times New Roman"/>
           <w:b w:val="0"/>
-          <w:i w:val="0"/>
-          <w:color w:val="000000"/>
-          <w:sz w:val="22"/>
+        </w:rPr>
+        <w:t>• связь между перечисленными страховыми документами.</w:t>
+      </w:r>
+    </w:p>
+    <w:p>
+      <w:pPr>
+        <w:widowControl/>
+        <w:jc w:val="both"/>
+      </w:pPr>
+      <w:r>
+        <w:rPr>
+          <w:rFonts w:ascii="Times New Roman" w:hAnsi="Times New Roman" w:eastAsia="Times New Roman"/>
+          <w:b w:val="0"/>
         </w:rPr>
         <w:t>Согласно ст. 1072 ГК РФ и пп. 63–65 Постановления Пленума Верховного Суда РФ от 08.11.2022 №31 причинитель вреда возмещает разницу между фактическим размером ущерба и надлежащим размером страхового возмещения только при недостаточности последнего для полного возмещения вреда.</w:t>
       </w:r>
     </w:p>
     <w:p>
       <w:pPr>
-        <w:ind w:firstLine="709"/>
+        <w:widowControl/>
+        <w:jc w:val="both"/>
       </w:pPr>
       <w:r>
         <w:rPr>
-          <w:rFonts w:ascii="Times New Roman" w:hAnsi="Times New Roman" w:cs="Times New Roman" w:eastAsia="Times New Roman"/>
+          <w:rFonts w:ascii="Times New Roman" w:hAnsi="Times New Roman" w:eastAsia="Times New Roman"/>
           <w:b w:val="0"/>
-          <w:i w:val="0"/>
-          <w:color w:val="000000"/>
-          <w:sz w:val="22"/>
         </w:rPr>
         <w:t>Поэтому участие страховщика и его процессуальный статус зависят от фактических обстоятельств обращения по ОСАГО/ПВУ.</w:t>
       </w:r>
@@ -415,29 +291,26 @@
     <w:p>
       <w:pPr>
         <w:pStyle w:val="Heading2"/>
+        <w:jc w:val="left"/>
       </w:pPr>
       <w:r>
         <w:rPr>
-          <w:rFonts w:ascii="Times New Roman" w:hAnsi="Times New Roman" w:cs="Times New Roman" w:eastAsia="Times New Roman"/>
+          <w:rFonts w:ascii="Times New Roman" w:hAnsi="Times New Roman" w:eastAsia="Times New Roman"/>
           <w:b/>
-          <w:i w:val="0"/>
           <w:color w:val="000000"/>
-          <w:sz w:val="25"/>
         </w:rPr>
         <w:t>Вариант A. Обращения по ОСАГО/ПВУ не было</w:t>
       </w:r>
     </w:p>
     <w:p>
       <w:pPr>
-        <w:ind w:firstLine="709"/>
+        <w:widowControl/>
+        <w:jc w:val="both"/>
       </w:pPr>
       <w:r>
         <w:rPr>
-          <w:rFonts w:ascii="Times New Roman" w:hAnsi="Times New Roman" w:cs="Times New Roman" w:eastAsia="Times New Roman"/>
+          <w:rFonts w:ascii="Times New Roman" w:hAnsi="Times New Roman" w:eastAsia="Times New Roman"/>
           <w:b w:val="0"/>
-          <w:i w:val="0"/>
-          <w:color w:val="000000"/>
-          <w:sz w:val="22"/>
         </w:rPr>
         <w:t>Если ООО «ВИГОРАВТО» не обращалось с заявлением по ОСАГО либо ПВУ, необходимо установить надлежащего страховщика, привлечь его в качестве ответчика и разрешить последствия несоблюдения обязательного досудебного порядка, включая вопрос об оставлении требований без рассмотрения в порядке п. 114 Постановления Пленума №31.</w:t>
       </w:r>
@@ -445,59 +318,52 @@
     <w:p>
       <w:pPr>
         <w:pStyle w:val="Heading2"/>
+        <w:jc w:val="left"/>
       </w:pPr>
       <w:r>
         <w:rPr>
-          <w:rFonts w:ascii="Times New Roman" w:hAnsi="Times New Roman" w:cs="Times New Roman" w:eastAsia="Times New Roman"/>
+          <w:rFonts w:ascii="Times New Roman" w:hAnsi="Times New Roman" w:eastAsia="Times New Roman"/>
           <w:b/>
-          <w:i w:val="0"/>
           <w:color w:val="000000"/>
-          <w:sz w:val="25"/>
         </w:rPr>
         <w:t>Вариант B. Обращение по ОСАГО/ПВУ было</w:t>
       </w:r>
     </w:p>
     <w:p>
       <w:pPr>
-        <w:ind w:firstLine="709"/>
+        <w:widowControl/>
+        <w:jc w:val="both"/>
       </w:pPr>
       <w:r>
         <w:rPr>
-          <w:rFonts w:ascii="Times New Roman" w:hAnsi="Times New Roman" w:cs="Times New Roman" w:eastAsia="Times New Roman"/>
+          <w:rFonts w:ascii="Times New Roman" w:hAnsi="Times New Roman" w:eastAsia="Times New Roman"/>
           <w:b w:val="0"/>
-          <w:i w:val="0"/>
-          <w:color w:val="000000"/>
-          <w:sz w:val="22"/>
         </w:rPr>
         <w:t>Если обращение было и обязательный порядок соблюдён, необходимо привлечь соответствующего страховщика третьим лицом и определить разницу между фактическим ущербом и надлежащим страховым возмещением.</w:t>
       </w:r>
     </w:p>
     <w:p>
       <w:pPr>
-        <w:ind w:firstLine="709"/>
+        <w:widowControl/>
+        <w:jc w:val="both"/>
       </w:pPr>
       <w:r>
         <w:rPr>
-          <w:rFonts w:ascii="Times New Roman" w:hAnsi="Times New Roman" w:cs="Times New Roman" w:eastAsia="Times New Roman"/>
+          <w:rFonts w:ascii="Times New Roman" w:hAnsi="Times New Roman" w:eastAsia="Times New Roman"/>
           <w:b w:val="0"/>
-          <w:i w:val="0"/>
-          <w:color w:val="000000"/>
-          <w:sz w:val="22"/>
         </w:rPr>
         <w:t>АО «Зетта Страхование» указано в иске как страховщик ответственности ответчика. Это обстоятельство позволяет истребовать у него сведения и материалы, но не предрешает окончательный процессуальный статус до установления факта обращения по ОСАГО/ПВУ.</w:t>
       </w:r>
     </w:p>
     <w:p>
       <w:pPr>
-        <w:ind w:firstLine="709"/>
+        <w:widowControl/>
+        <w:jc w:val="both"/>
       </w:pPr>
       <w:r>
         <w:rPr>
-          <w:rFonts w:ascii="Times New Roman" w:hAnsi="Times New Roman" w:cs="Times New Roman" w:eastAsia="Times New Roman"/>
+          <w:rFonts w:ascii="Times New Roman" w:hAnsi="Times New Roman" w:eastAsia="Times New Roman"/>
           <w:b w:val="0"/>
-          <w:i w:val="0"/>
-          <w:color w:val="000000"/>
-          <w:sz w:val="22"/>
         </w:rPr>
         <w:t>По АО ГСК «Югория» процессуальный вопрос следует разрешить после получения сведений о том, предъявлялось ли суброгационное требование к ОСАГО-страховщику, в каком размере и какое решение по нему принято.</w:t>
       </w:r>
@@ -505,173 +371,109 @@
     <w:p>
       <w:pPr>
         <w:pStyle w:val="Heading2"/>
+        <w:jc w:val="left"/>
       </w:pPr>
       <w:r>
         <w:rPr>
-          <w:rFonts w:ascii="Times New Roman" w:hAnsi="Times New Roman" w:cs="Times New Roman" w:eastAsia="Times New Roman"/>
+          <w:rFonts w:ascii="Times New Roman" w:hAnsi="Times New Roman" w:eastAsia="Times New Roman"/>
           <w:b/>
-          <w:i w:val="0"/>
           <w:color w:val="000000"/>
-          <w:sz w:val="25"/>
         </w:rPr>
         <w:t>Прошу суд</w:t>
       </w:r>
     </w:p>
     <w:p>
       <w:pPr>
-        <w:spacing w:after="40"/>
-        <w:ind w:left="567" w:hanging="283"/>
+        <w:widowControl/>
+        <w:ind w:left="346" w:hanging="259"/>
         <w:jc w:val="both"/>
       </w:pPr>
       <w:r>
         <w:rPr>
-          <w:rFonts w:ascii="Times New Roman" w:hAnsi="Times New Roman" w:cs="Times New Roman" w:eastAsia="Times New Roman"/>
-          <w:color w:val="000000"/>
-          <w:sz w:val="22"/>
+          <w:rFonts w:ascii="Times New Roman" w:hAnsi="Times New Roman" w:eastAsia="Times New Roman"/>
+          <w:b w:val="0"/>
         </w:rPr>
-        <w:t xml:space="preserve">1. </w:t>
-      </w:r>
-      <w:r>
-        <w:rPr>
-          <w:rFonts w:ascii="Times New Roman" w:hAnsi="Times New Roman" w:cs="Times New Roman" w:eastAsia="Times New Roman"/>
-          <w:b w:val="0"/>
-          <w:i w:val="0"/>
-          <w:color w:val="000000"/>
-          <w:sz w:val="22"/>
-        </w:rPr>
-        <w:t>Установить, обращалось ли ООО «ВИГОРАВТО» по ОСАГО либо ПВУ и был ли соблюдён обязательный досудебный порядок.</w:t>
+        <w:t>1. Установить, обращалось ли ООО «ВИГОРАВТО» по ОСАГО либо ПВУ и был ли соблюдён обязательный досудебный порядок.</w:t>
       </w:r>
     </w:p>
     <w:p>
       <w:pPr>
-        <w:spacing w:after="40"/>
-        <w:ind w:left="567" w:hanging="283"/>
+        <w:widowControl/>
+        <w:ind w:left="346" w:hanging="259"/>
         <w:jc w:val="both"/>
       </w:pPr>
       <w:r>
         <w:rPr>
-          <w:rFonts w:ascii="Times New Roman" w:hAnsi="Times New Roman" w:cs="Times New Roman" w:eastAsia="Times New Roman"/>
-          <w:color w:val="000000"/>
-          <w:sz w:val="22"/>
+          <w:rFonts w:ascii="Times New Roman" w:hAnsi="Times New Roman" w:eastAsia="Times New Roman"/>
+          <w:b w:val="0"/>
         </w:rPr>
-        <w:t xml:space="preserve">2. </w:t>
-      </w:r>
-      <w:r>
-        <w:rPr>
-          <w:rFonts w:ascii="Times New Roman" w:hAnsi="Times New Roman" w:cs="Times New Roman" w:eastAsia="Times New Roman"/>
-          <w:b w:val="0"/>
-          <w:i w:val="0"/>
-          <w:color w:val="000000"/>
-          <w:sz w:val="22"/>
-        </w:rPr>
-        <w:t>Если обращение отсутствовало, установить надлежащего страховщика, привлечь его в качестве ответчика и применить последствия, предусмотренные п. 114 Постановления Пленума №31.</w:t>
+        <w:t>2. Если обращение отсутствовало, установить надлежащего страховщика, привлечь его в качестве ответчика и применить последствия, предусмотренные п. 114 Постановления Пленума №31.</w:t>
       </w:r>
     </w:p>
     <w:p>
       <w:pPr>
-        <w:spacing w:after="40"/>
-        <w:ind w:left="567" w:hanging="283"/>
+        <w:widowControl/>
+        <w:ind w:left="346" w:hanging="259"/>
         <w:jc w:val="both"/>
       </w:pPr>
       <w:r>
         <w:rPr>
-          <w:rFonts w:ascii="Times New Roman" w:hAnsi="Times New Roman" w:cs="Times New Roman" w:eastAsia="Times New Roman"/>
-          <w:color w:val="000000"/>
-          <w:sz w:val="22"/>
+          <w:rFonts w:ascii="Times New Roman" w:hAnsi="Times New Roman" w:eastAsia="Times New Roman"/>
+          <w:b w:val="0"/>
         </w:rPr>
-        <w:t xml:space="preserve">3. </w:t>
-      </w:r>
-      <w:r>
-        <w:rPr>
-          <w:rFonts w:ascii="Times New Roman" w:hAnsi="Times New Roman" w:cs="Times New Roman" w:eastAsia="Times New Roman"/>
-          <w:b w:val="0"/>
-          <w:i w:val="0"/>
-          <w:color w:val="000000"/>
-          <w:sz w:val="22"/>
-        </w:rPr>
-        <w:t>Если обращение было и обязательный порядок соблюдён, привлечь соответствующего страховщика третьим лицом и определить надлежащий размер ОСАГО-возмещения.</w:t>
+        <w:t>3. Если обращение было и обязательный порядок соблюдён, привлечь соответствующего страховщика третьим лицом и определить надлежащий размер ОСАГО-возмещения.</w:t>
       </w:r>
     </w:p>
     <w:p>
       <w:pPr>
-        <w:spacing w:after="40"/>
-        <w:ind w:left="567" w:hanging="283"/>
+        <w:widowControl/>
+        <w:ind w:left="346" w:hanging="259"/>
         <w:jc w:val="both"/>
       </w:pPr>
       <w:r>
         <w:rPr>
-          <w:rFonts w:ascii="Times New Roman" w:hAnsi="Times New Roman" w:cs="Times New Roman" w:eastAsia="Times New Roman"/>
-          <w:color w:val="000000"/>
-          <w:sz w:val="22"/>
+          <w:rFonts w:ascii="Times New Roman" w:hAnsi="Times New Roman" w:eastAsia="Times New Roman"/>
+          <w:b w:val="0"/>
         </w:rPr>
-        <w:t xml:space="preserve">4. </w:t>
-      </w:r>
-      <w:r>
-        <w:rPr>
-          <w:rFonts w:ascii="Times New Roman" w:hAnsi="Times New Roman" w:cs="Times New Roman" w:eastAsia="Times New Roman"/>
-          <w:b w:val="0"/>
-          <w:i w:val="0"/>
-          <w:color w:val="000000"/>
-          <w:sz w:val="22"/>
-        </w:rPr>
-        <w:t>Истребовать у АО «Зетта Страхование» сведения о поступивших обращениях по ДТП от 29.10.2023, расчётах, выплатах, отказах и суброгации.</w:t>
+        <w:t>4. Истребовать у АО «Зетта Страхование» сведения о поступивших обращениях по ДТП от 29.10.2023, расчётах, выплатах, отказах и суброгации.</w:t>
       </w:r>
     </w:p>
     <w:p>
       <w:pPr>
-        <w:spacing w:after="40"/>
-        <w:ind w:left="567" w:hanging="283"/>
+        <w:widowControl/>
+        <w:ind w:left="346" w:hanging="259"/>
         <w:jc w:val="both"/>
       </w:pPr>
       <w:r>
         <w:rPr>
-          <w:rFonts w:ascii="Times New Roman" w:hAnsi="Times New Roman" w:cs="Times New Roman" w:eastAsia="Times New Roman"/>
-          <w:color w:val="000000"/>
-          <w:sz w:val="22"/>
+          <w:rFonts w:ascii="Times New Roman" w:hAnsi="Times New Roman" w:eastAsia="Times New Roman"/>
+          <w:b w:val="0"/>
         </w:rPr>
-        <w:t xml:space="preserve">5. </w:t>
-      </w:r>
-      <w:r>
-        <w:rPr>
-          <w:rFonts w:ascii="Times New Roman" w:hAnsi="Times New Roman" w:cs="Times New Roman" w:eastAsia="Times New Roman"/>
-          <w:b w:val="0"/>
-          <w:i w:val="0"/>
-          <w:color w:val="000000"/>
-          <w:sz w:val="22"/>
-        </w:rPr>
-        <w:t>После получения этих сведений разрешить вопрос о процессуальном статусе АО ГСК «Югория».</w:t>
+        <w:t>5. После получения этих сведений разрешить вопрос о процессуальном статусе АО ГСК «Югория».</w:t>
       </w:r>
     </w:p>
     <w:p>
       <w:pPr>
-        <w:spacing w:after="40"/>
-        <w:ind w:firstLine="0"/>
-        <w:jc w:val="left"/>
+        <w:widowControl/>
+        <w:jc w:val="both"/>
       </w:pPr>
       <w:r>
         <w:rPr>
-          <w:rFonts w:ascii="Times New Roman" w:hAnsi="Times New Roman" w:cs="Times New Roman" w:eastAsia="Times New Roman"/>
-          <w:b/>
-          <w:i w:val="0"/>
-          <w:color w:val="000000"/>
-          <w:sz w:val="22"/>
+          <w:rFonts w:ascii="Times New Roman" w:hAnsi="Times New Roman" w:eastAsia="Times New Roman"/>
+          <w:b w:val="0"/>
         </w:rPr>
         <w:t>Ответчик: __________ / Димитриева М.В. /</w:t>
       </w:r>
     </w:p>
     <w:p>
       <w:pPr>
-        <w:spacing w:after="40"/>
-        <w:ind w:firstLine="0"/>
-        <w:jc w:val="left"/>
+        <w:widowControl/>
+        <w:jc w:val="both"/>
       </w:pPr>
       <w:r>
         <w:rPr>
-          <w:rFonts w:ascii="Times New Roman" w:hAnsi="Times New Roman" w:cs="Times New Roman" w:eastAsia="Times New Roman"/>
+          <w:rFonts w:ascii="Times New Roman" w:hAnsi="Times New Roman" w:eastAsia="Times New Roman"/>
           <w:b w:val="0"/>
-          <w:i w:val="0"/>
-          <w:color w:val="000000"/>
-          <w:sz w:val="22"/>
         </w:rPr>
         <w:t>Дата: __________</w:t>
       </w:r>
@@ -1116,7 +918,7 @@
     <w:qFormat/>
     <w:rsid w:val="00FC693F"/>
     <w:pPr>
-      <w:spacing w:after="80" w:line="259" w:lineRule="auto"/>
+      <w:spacing w:after="100" w:line="269" w:lineRule="auto"/>
       <w:jc w:val="both"/>
     </w:pPr>
     <w:rPr>
@@ -1124,7 +926,7 @@
       <w:b w:val="0"/>
       <w:i w:val="0"/>
       <w:color w:val="000000"/>
-      <w:sz w:val="22"/>
+      <w:sz w:val="21"/>
     </w:rPr>
   </w:style>
   <w:style w:type="paragraph" w:styleId="Header">
@@ -1182,7 +984,7 @@
     <w:pPr>
       <w:keepNext/>
       <w:keepLines/>
-      <w:spacing w:before="160" w:after="80"/>
+      <w:spacing w:before="180" w:after="100"/>
       <w:outlineLvl w:val="0"/>
     </w:pPr>
     <w:rPr>
@@ -1191,7 +993,7 @@
       <w:bCs/>
       <w:i w:val="0"/>
       <w:color w:val="000000"/>
-      <w:sz w:val="30"/>
+      <w:sz w:val="26"/>
       <w:szCs w:val="28"/>
     </w:rPr>
   </w:style>
@@ -1207,7 +1009,7 @@
     <w:pPr>
       <w:keepNext/>
       <w:keepLines/>
-      <w:spacing w:before="160" w:after="80"/>
+      <w:spacing w:before="180" w:after="100"/>
       <w:outlineLvl w:val="1"/>
     </w:pPr>
     <w:rPr>
@@ -1216,7 +1018,7 @@
       <w:bCs/>
       <w:i w:val="0"/>
       <w:color w:val="000000"/>
-      <w:sz w:val="25"/>
+      <w:sz w:val="23"/>
       <w:szCs w:val="26"/>
     </w:rPr>
   </w:style>
@@ -1232,7 +1034,7 @@
     <w:pPr>
       <w:keepNext/>
       <w:keepLines/>
-      <w:spacing w:before="160" w:after="80"/>
+      <w:spacing w:before="180" w:after="100"/>
       <w:outlineLvl w:val="2"/>
     </w:pPr>
     <w:rPr>
@@ -1241,7 +1043,7 @@
       <w:bCs/>
       <w:i w:val="0"/>
       <w:color w:val="000000"/>
-      <w:sz w:val="23"/>
+      <w:sz w:val="21"/>
     </w:rPr>
   </w:style>
   <w:style w:type="paragraph" w:styleId="Heading4">
@@ -1473,10 +1275,8 @@
     <w:rsid w:val="00FC693F"/>
     <w:pPr>
       <w:keepNext/>
-      <w:pBdr>
-        <w:bottom w:val="single" w:sz="8" w:space="4" w:color="4F81BD" w:themeColor="accent1"/>
-      </w:pBdr>
-      <w:spacing w:after="80" w:line="240" w:lineRule="auto" w:before="160"/>
+      <w:keepLines/>
+      <w:spacing w:after="100" w:line="240" w:lineRule="auto" w:before="180"/>
       <w:contextualSpacing/>
     </w:pPr>
     <w:rPr>
@@ -1519,12 +1319,13 @@
       </w:numPr>
     </w:pPr>
     <w:rPr>
-      <w:rFonts w:asciiTheme="majorHAnsi" w:eastAsiaTheme="majorEastAsia" w:hAnsiTheme="majorHAnsi" w:cstheme="majorBidi"/>
+      <w:rFonts w:asciiTheme="majorHAnsi" w:eastAsiaTheme="majorEastAsia" w:hAnsiTheme="majorHAnsi" w:cstheme="majorBidi" w:ascii="Times New Roman" w:hAnsi="Times New Roman" w:eastAsia="Times New Roman" w:cs="Times New Roman"/>
+      <w:b w:val="0"/>
       <w:i/>
       <w:iCs/>
-      <w:color w:val="4F81BD" w:themeColor="accent1"/>
+      <w:color w:val="000000"/>
       <w:spacing w:val="15"/>
-      <w:sz w:val="24"/>
+      <w:sz w:val="21"/>
       <w:szCs w:val="24"/>
     </w:rPr>
   </w:style>

</xml_diff>